<commit_message>
sync(docs): ensure 附件一 exact binary parity with main report
</commit_message>
<xml_diff>
--- a/附件一_富宇大境社區管理委員會法定獨立分割報告書.docx
+++ b/附件一_富宇大境社區管理委員會法定獨立分割報告書.docx
@@ -68,9 +68,6 @@
               <w:right w:w="0" w:type="dxa"/>
             </w:tcMar>
             <w:shd w:fill="1A1D20"/>
-            <w:shd w:fill="1A1D20"/>
-            <w:shd w:fill="1A1D20"/>
-            <w:shd w:fill="1A1D20"/>
           </w:tcPr>
           <w:p/>
         </w:tc>
@@ -99,9 +96,6 @@
               <w:right w:w="130" w:type="dxa"/>
             </w:tcMar>
             <w:shd w:fill="1A1D20"/>
-            <w:shd w:fill="1A1D20"/>
-            <w:shd w:fill="1A1D20"/>
-            <w:shd w:fill="1A1D20"/>
           </w:tcPr>
           <w:p>
             <w:r>
@@ -126,9 +120,6 @@
               <w:right w:w="130" w:type="dxa"/>
             </w:tcMar>
             <w:shd w:fill="1A1D20"/>
-            <w:shd w:fill="1A1D20"/>
-            <w:shd w:fill="1A1D20"/>
-            <w:shd w:fill="1A1D20"/>
           </w:tcPr>
           <w:p>
             <w:r>
@@ -138,7 +129,7 @@
                 <w:color w:val="D4AF37"/>
                 <w:sz w:val="18"/>
               </w:rPr>
-              <w:t>富宇大境（A2 區）透天別墅（龍社路 595、597、599、601、603、605 號，共 6 戶）</w:t>
+              <w:t>富宇大境（A2 區）透天別墅（龍社路 593、595、597、599、601、603 號，共 6 戶）</w:t>
             </w:r>
           </w:p>
         </w:tc>
@@ -154,9 +145,6 @@
               <w:left w:w="130" w:type="dxa"/>
               <w:right w:w="130" w:type="dxa"/>
             </w:tcMar>
-            <w:shd w:fill="FFFDF5"/>
-            <w:shd w:fill="FFFDF5"/>
-            <w:shd w:fill="FFFDF5"/>
             <w:shd w:fill="FFFDF5"/>
           </w:tcPr>
           <w:p>
@@ -181,9 +169,6 @@
               <w:left w:w="130" w:type="dxa"/>
               <w:right w:w="130" w:type="dxa"/>
             </w:tcMar>
-            <w:shd w:fill="FFFDF5"/>
-            <w:shd w:fill="FFFDF5"/>
-            <w:shd w:fill="FFFDF5"/>
             <w:shd w:fill="FFFDF5"/>
           </w:tcPr>
           <w:p>
@@ -210,9 +195,6 @@
               <w:right w:w="130" w:type="dxa"/>
             </w:tcMar>
             <w:shd w:fill="FAF8F2"/>
-            <w:shd w:fill="FAF8F2"/>
-            <w:shd w:fill="FAF8F2"/>
-            <w:shd w:fill="FAF8F2"/>
           </w:tcPr>
           <w:p>
             <w:r>
@@ -236,9 +218,6 @@
               <w:left w:w="130" w:type="dxa"/>
               <w:right w:w="130" w:type="dxa"/>
             </w:tcMar>
-            <w:shd w:fill="FAF8F2"/>
-            <w:shd w:fill="FAF8F2"/>
-            <w:shd w:fill="FAF8F2"/>
             <w:shd w:fill="FAF8F2"/>
           </w:tcPr>
           <w:p>
@@ -265,9 +244,6 @@
               <w:right w:w="130" w:type="dxa"/>
             </w:tcMar>
             <w:shd w:fill="FFFDF5"/>
-            <w:shd w:fill="FFFDF5"/>
-            <w:shd w:fill="FFFDF5"/>
-            <w:shd w:fill="FFFDF5"/>
           </w:tcPr>
           <w:p>
             <w:r>
@@ -291,9 +267,6 @@
               <w:left w:w="130" w:type="dxa"/>
               <w:right w:w="130" w:type="dxa"/>
             </w:tcMar>
-            <w:shd w:fill="FFFDF5"/>
-            <w:shd w:fill="FFFDF5"/>
-            <w:shd w:fill="FFFDF5"/>
             <w:shd w:fill="FFFDF5"/>
           </w:tcPr>
           <w:p>
@@ -320,9 +293,6 @@
               <w:right w:w="130" w:type="dxa"/>
             </w:tcMar>
             <w:shd w:fill="FAF8F2"/>
-            <w:shd w:fill="FAF8F2"/>
-            <w:shd w:fill="FAF8F2"/>
-            <w:shd w:fill="FAF8F2"/>
           </w:tcPr>
           <w:p>
             <w:r>
@@ -346,9 +316,6 @@
               <w:left w:w="130" w:type="dxa"/>
               <w:right w:w="130" w:type="dxa"/>
             </w:tcMar>
-            <w:shd w:fill="FAF8F2"/>
-            <w:shd w:fill="FAF8F2"/>
-            <w:shd w:fill="FAF8F2"/>
             <w:shd w:fill="FAF8F2"/>
           </w:tcPr>
           <w:p>
@@ -375,9 +342,6 @@
               <w:right w:w="130" w:type="dxa"/>
             </w:tcMar>
             <w:shd w:fill="FFFDF5"/>
-            <w:shd w:fill="FFFDF5"/>
-            <w:shd w:fill="FFFDF5"/>
-            <w:shd w:fill="FFFDF5"/>
           </w:tcPr>
           <w:p>
             <w:r>
@@ -402,9 +366,6 @@
               <w:right w:w="130" w:type="dxa"/>
             </w:tcMar>
             <w:shd w:fill="FFFDF5"/>
-            <w:shd w:fill="FFFDF5"/>
-            <w:shd w:fill="FFFDF5"/>
-            <w:shd w:fill="FFFDF5"/>
           </w:tcPr>
           <w:p>
             <w:r>
@@ -413,7 +374,7 @@
                 <w:color w:val="2D3748"/>
                 <w:sz w:val="18"/>
               </w:rPr>
-              <w:t>Howard Liao Ph.D.（社區治理戰略諮詢）</w:t>
+              <w:t>廖倫豪（社區治理諮詢）</w:t>
             </w:r>
           </w:p>
         </w:tc>
@@ -494,9 +455,6 @@
               <w:bottom w:val="none"/>
             </w:tcBorders>
             <w:shd w:fill="1A1D20"/>
-            <w:shd w:fill="1A1D20"/>
-            <w:shd w:fill="1A1D20"/>
-            <w:shd w:fill="1A1D20"/>
           </w:tcPr>
           <w:p>
             <w:pPr>
@@ -519,7 +477,7 @@
                 <w:color w:val="D4AF37"/>
                 <w:sz w:val="18"/>
               </w:rPr>
-              <w:t>1. 地理出入完全獨立：A2 大境 6 戶門牌臨龍社路公有道路，出入絕不途經內部 628、642 巷道。</w:t>
+              <w:t>1. 地理出入完全獨立：A2 大境 6 戶門牌臨龍社路公有道路，出入絕不途經富宇大地內部私設巷道（如 642 巷等）。</w:t>
               <w:br/>
               <w:t>2. 垃圾清運完全非依賴：大境住戶門前即可直接等待台中市環保局公有垃圾車，完全未使用大社區內部睿豐每週二次之收費子母車（每桶 1,000 元）。</w:t>
               <w:br/>
@@ -632,9 +590,6 @@
               <w:right w:w="100" w:type="dxa"/>
             </w:tcMar>
             <w:shd w:fill="1A1D20"/>
-            <w:shd w:fill="1A1D20"/>
-            <w:shd w:fill="1A1D20"/>
-            <w:shd w:fill="1A1D20"/>
           </w:tcPr>
           <w:p>
             <w:r>
@@ -658,9 +613,6 @@
               <w:left w:w="100" w:type="dxa"/>
               <w:right w:w="100" w:type="dxa"/>
             </w:tcMar>
-            <w:shd w:fill="1A1D20"/>
-            <w:shd w:fill="1A1D20"/>
-            <w:shd w:fill="1A1D20"/>
             <w:shd w:fill="1A1D20"/>
           </w:tcPr>
           <w:p>
@@ -686,9 +638,6 @@
               <w:right w:w="100" w:type="dxa"/>
             </w:tcMar>
             <w:shd w:fill="1A1D20"/>
-            <w:shd w:fill="1A1D20"/>
-            <w:shd w:fill="1A1D20"/>
-            <w:shd w:fill="1A1D20"/>
           </w:tcPr>
           <w:p>
             <w:r>
@@ -713,9 +662,6 @@
               <w:right w:w="100" w:type="dxa"/>
             </w:tcMar>
             <w:shd w:fill="1A1D20"/>
-            <w:shd w:fill="1A1D20"/>
-            <w:shd w:fill="1A1D20"/>
-            <w:shd w:fill="1A1D20"/>
           </w:tcPr>
           <w:p>
             <w:r>
@@ -739,9 +685,6 @@
               <w:left w:w="100" w:type="dxa"/>
               <w:right w:w="100" w:type="dxa"/>
             </w:tcMar>
-            <w:shd w:fill="1A1D20"/>
-            <w:shd w:fill="1A1D20"/>
-            <w:shd w:fill="1A1D20"/>
             <w:shd w:fill="1A1D20"/>
           </w:tcPr>
           <w:p>
@@ -769,9 +712,6 @@
               <w:right w:w="100" w:type="dxa"/>
             </w:tcMar>
             <w:shd w:fill="FFFDF5"/>
-            <w:shd w:fill="FFFDF5"/>
-            <w:shd w:fill="FFFDF5"/>
-            <w:shd w:fill="FFFDF5"/>
           </w:tcPr>
           <w:p>
             <w:r>
@@ -795,9 +735,6 @@
               <w:left w:w="100" w:type="dxa"/>
               <w:right w:w="100" w:type="dxa"/>
             </w:tcMar>
-            <w:shd w:fill="FFFDF5"/>
-            <w:shd w:fill="FFFDF5"/>
-            <w:shd w:fill="FFFDF5"/>
             <w:shd w:fill="FFFDF5"/>
           </w:tcPr>
           <w:p>
@@ -823,9 +760,6 @@
               <w:right w:w="100" w:type="dxa"/>
             </w:tcMar>
             <w:shd w:fill="FFFDF5"/>
-            <w:shd w:fill="FFFDF5"/>
-            <w:shd w:fill="FFFDF5"/>
-            <w:shd w:fill="FFFDF5"/>
           </w:tcPr>
           <w:p>
             <w:r>
@@ -849,9 +783,6 @@
               <w:right w:w="100" w:type="dxa"/>
             </w:tcMar>
             <w:shd w:fill="FFFDF5"/>
-            <w:shd w:fill="FFFDF5"/>
-            <w:shd w:fill="FFFDF5"/>
-            <w:shd w:fill="FFFDF5"/>
           </w:tcPr>
           <w:p>
             <w:r>
@@ -874,9 +805,6 @@
               <w:left w:w="100" w:type="dxa"/>
               <w:right w:w="100" w:type="dxa"/>
             </w:tcMar>
-            <w:shd w:fill="FFFDF5"/>
-            <w:shd w:fill="FFFDF5"/>
-            <w:shd w:fill="FFFDF5"/>
             <w:shd w:fill="FFFDF5"/>
           </w:tcPr>
           <w:p>
@@ -903,9 +831,6 @@
               <w:right w:w="100" w:type="dxa"/>
             </w:tcMar>
             <w:shd w:fill="FAF8F2"/>
-            <w:shd w:fill="FAF8F2"/>
-            <w:shd w:fill="FAF8F2"/>
-            <w:shd w:fill="FAF8F2"/>
           </w:tcPr>
           <w:p>
             <w:r>
@@ -929,9 +854,6 @@
               <w:left w:w="100" w:type="dxa"/>
               <w:right w:w="100" w:type="dxa"/>
             </w:tcMar>
-            <w:shd w:fill="FAF8F2"/>
-            <w:shd w:fill="FAF8F2"/>
-            <w:shd w:fill="FAF8F2"/>
             <w:shd w:fill="FAF8F2"/>
           </w:tcPr>
           <w:p>
@@ -957,9 +879,6 @@
               <w:right w:w="100" w:type="dxa"/>
             </w:tcMar>
             <w:shd w:fill="FAF8F2"/>
-            <w:shd w:fill="FAF8F2"/>
-            <w:shd w:fill="FAF8F2"/>
-            <w:shd w:fill="FAF8F2"/>
           </w:tcPr>
           <w:p>
             <w:r>
@@ -983,9 +902,6 @@
               <w:right w:w="100" w:type="dxa"/>
             </w:tcMar>
             <w:shd w:fill="FAF8F2"/>
-            <w:shd w:fill="FAF8F2"/>
-            <w:shd w:fill="FAF8F2"/>
-            <w:shd w:fill="FAF8F2"/>
           </w:tcPr>
           <w:p>
             <w:r>
@@ -1008,9 +924,6 @@
               <w:left w:w="100" w:type="dxa"/>
               <w:right w:w="100" w:type="dxa"/>
             </w:tcMar>
-            <w:shd w:fill="FAF8F2"/>
-            <w:shd w:fill="FAF8F2"/>
-            <w:shd w:fill="FAF8F2"/>
             <w:shd w:fill="FAF8F2"/>
           </w:tcPr>
           <w:p>
@@ -1037,9 +950,6 @@
               <w:right w:w="100" w:type="dxa"/>
             </w:tcMar>
             <w:shd w:fill="FFFDF5"/>
-            <w:shd w:fill="FFFDF5"/>
-            <w:shd w:fill="FFFDF5"/>
-            <w:shd w:fill="FFFDF5"/>
           </w:tcPr>
           <w:p>
             <w:r>
@@ -1063,9 +973,6 @@
               <w:left w:w="100" w:type="dxa"/>
               <w:right w:w="100" w:type="dxa"/>
             </w:tcMar>
-            <w:shd w:fill="FFFDF5"/>
-            <w:shd w:fill="FFFDF5"/>
-            <w:shd w:fill="FFFDF5"/>
             <w:shd w:fill="FFFDF5"/>
           </w:tcPr>
           <w:p>
@@ -1091,9 +998,6 @@
               <w:right w:w="100" w:type="dxa"/>
             </w:tcMar>
             <w:shd w:fill="FFFDF5"/>
-            <w:shd w:fill="FFFDF5"/>
-            <w:shd w:fill="FFFDF5"/>
-            <w:shd w:fill="FFFDF5"/>
           </w:tcPr>
           <w:p>
             <w:r>
@@ -1116,9 +1020,6 @@
               <w:left w:w="100" w:type="dxa"/>
               <w:right w:w="100" w:type="dxa"/>
             </w:tcMar>
-            <w:shd w:fill="FFFDF5"/>
-            <w:shd w:fill="FFFDF5"/>
-            <w:shd w:fill="FFFDF5"/>
             <w:shd w:fill="FFFDF5"/>
           </w:tcPr>
           <w:p>
@@ -1143,9 +1044,6 @@
               <w:right w:w="100" w:type="dxa"/>
             </w:tcMar>
             <w:shd w:fill="FFFDF5"/>
-            <w:shd w:fill="FFFDF5"/>
-            <w:shd w:fill="FFFDF5"/>
-            <w:shd w:fill="FFFDF5"/>
           </w:tcPr>
           <w:p>
             <w:r>
@@ -1154,7 +1052,7 @@
                 <w:color w:val="2D3748"/>
                 <w:sz w:val="17"/>
               </w:rPr>
-              <w:t>經由龍社路 628 巷內部巷道進出，高度共用巷道與環保室</w:t>
+              <w:t>經由龍社路內部私設巷道進出，高度共用巷道與環保室</w:t>
             </w:r>
           </w:p>
         </w:tc>
@@ -1170,9 +1068,6 @@
               <w:left w:w="100" w:type="dxa"/>
               <w:right w:w="100" w:type="dxa"/>
             </w:tcMar>
-            <w:shd w:fill="FAF8F2"/>
-            <w:shd w:fill="FAF8F2"/>
-            <w:shd w:fill="FAF8F2"/>
             <w:shd w:fill="FAF8F2"/>
           </w:tcPr>
           <w:p>
@@ -1198,9 +1093,6 @@
               <w:right w:w="100" w:type="dxa"/>
             </w:tcMar>
             <w:shd w:fill="FAF8F2"/>
-            <w:shd w:fill="FAF8F2"/>
-            <w:shd w:fill="FAF8F2"/>
-            <w:shd w:fill="FAF8F2"/>
           </w:tcPr>
           <w:p>
             <w:r>
@@ -1225,9 +1117,6 @@
               <w:right w:w="100" w:type="dxa"/>
             </w:tcMar>
             <w:shd w:fill="FAF8F2"/>
-            <w:shd w:fill="FAF8F2"/>
-            <w:shd w:fill="FAF8F2"/>
-            <w:shd w:fill="FAF8F2"/>
           </w:tcPr>
           <w:p>
             <w:r>
@@ -1250,9 +1139,6 @@
               <w:left w:w="100" w:type="dxa"/>
               <w:right w:w="100" w:type="dxa"/>
             </w:tcMar>
-            <w:shd w:fill="FAF8F2"/>
-            <w:shd w:fill="FAF8F2"/>
-            <w:shd w:fill="FAF8F2"/>
             <w:shd w:fill="FAF8F2"/>
           </w:tcPr>
           <w:p>
@@ -1277,9 +1163,6 @@
               <w:right w:w="100" w:type="dxa"/>
             </w:tcMar>
             <w:shd w:fill="FAF8F2"/>
-            <w:shd w:fill="FAF8F2"/>
-            <w:shd w:fill="FAF8F2"/>
-            <w:shd w:fill="FAF8F2"/>
           </w:tcPr>
           <w:p>
             <w:r>
@@ -1288,7 +1171,7 @@
                 <w:color w:val="2D3748"/>
                 <w:sz w:val="17"/>
               </w:rPr>
-              <w:t>經由龍社路 628 巷內部巷道進出，深處社區</w:t>
+              <w:t>經由龍社路內部私設巷道進出，深處社區</w:t>
             </w:r>
           </w:p>
         </w:tc>
@@ -1304,9 +1187,6 @@
               <w:left w:w="100" w:type="dxa"/>
               <w:right w:w="100" w:type="dxa"/>
             </w:tcMar>
-            <w:shd w:fill="FFFDF5"/>
-            <w:shd w:fill="FFFDF5"/>
-            <w:shd w:fill="FFFDF5"/>
             <w:shd w:fill="FFFDF5"/>
           </w:tcPr>
           <w:p>
@@ -1332,9 +1212,6 @@
               <w:right w:w="100" w:type="dxa"/>
             </w:tcMar>
             <w:shd w:fill="FFFDF5"/>
-            <w:shd w:fill="FFFDF5"/>
-            <w:shd w:fill="FFFDF5"/>
-            <w:shd w:fill="FFFDF5"/>
           </w:tcPr>
           <w:p>
             <w:r>
@@ -1359,9 +1236,6 @@
               <w:right w:w="100" w:type="dxa"/>
             </w:tcMar>
             <w:shd w:fill="FFFDF5"/>
-            <w:shd w:fill="FFFDF5"/>
-            <w:shd w:fill="FFFDF5"/>
-            <w:shd w:fill="FFFDF5"/>
           </w:tcPr>
           <w:p>
             <w:r>
@@ -1385,9 +1259,6 @@
               <w:right w:w="100" w:type="dxa"/>
             </w:tcMar>
             <w:shd w:fill="FFFDF5"/>
-            <w:shd w:fill="FFFDF5"/>
-            <w:shd w:fill="FFFDF5"/>
-            <w:shd w:fill="FFFDF5"/>
           </w:tcPr>
           <w:p>
             <w:r>
@@ -1410,9 +1281,6 @@
               <w:left w:w="100" w:type="dxa"/>
               <w:right w:w="100" w:type="dxa"/>
             </w:tcMar>
-            <w:shd w:fill="FFFDF5"/>
-            <w:shd w:fill="FFFDF5"/>
-            <w:shd w:fill="FFFDF5"/>
             <w:shd w:fill="FFFDF5"/>
           </w:tcPr>
           <w:p>
@@ -1439,9 +1307,6 @@
               <w:right w:w="100" w:type="dxa"/>
             </w:tcMar>
             <w:shd w:fill="FAF8F2"/>
-            <w:shd w:fill="FAF8F2"/>
-            <w:shd w:fill="FAF8F2"/>
-            <w:shd w:fill="FAF8F2"/>
           </w:tcPr>
           <w:p>
             <w:r>
@@ -1465,9 +1330,6 @@
               <w:left w:w="100" w:type="dxa"/>
               <w:right w:w="100" w:type="dxa"/>
             </w:tcMar>
-            <w:shd w:fill="FAF8F2"/>
-            <w:shd w:fill="FAF8F2"/>
-            <w:shd w:fill="FAF8F2"/>
             <w:shd w:fill="FAF8F2"/>
           </w:tcPr>
           <w:p>
@@ -1493,9 +1355,6 @@
               <w:right w:w="100" w:type="dxa"/>
             </w:tcMar>
             <w:shd w:fill="FAF8F2"/>
-            <w:shd w:fill="FAF8F2"/>
-            <w:shd w:fill="FAF8F2"/>
-            <w:shd w:fill="FAF8F2"/>
           </w:tcPr>
           <w:p>
             <w:r>
@@ -1519,9 +1378,6 @@
               <w:right w:w="100" w:type="dxa"/>
             </w:tcMar>
             <w:shd w:fill="FAF8F2"/>
-            <w:shd w:fill="FAF8F2"/>
-            <w:shd w:fill="FAF8F2"/>
-            <w:shd w:fill="FAF8F2"/>
           </w:tcPr>
           <w:p>
             <w:r>
@@ -1544,9 +1400,6 @@
               <w:left w:w="100" w:type="dxa"/>
               <w:right w:w="100" w:type="dxa"/>
             </w:tcMar>
-            <w:shd w:fill="FAF8F2"/>
-            <w:shd w:fill="FAF8F2"/>
-            <w:shd w:fill="FAF8F2"/>
             <w:shd w:fill="FAF8F2"/>
           </w:tcPr>
           <w:p>
@@ -1699,9 +1552,6 @@
               <w:bottom w:val="none"/>
             </w:tcBorders>
             <w:shd w:fill="1A1D20"/>
-            <w:shd w:fill="1A1D20"/>
-            <w:shd w:fill="1A1D20"/>
-            <w:shd w:fill="1A1D20"/>
           </w:tcPr>
           <w:p>
             <w:pPr>
@@ -1818,7 +1668,7 @@
           <w:color w:val="2D3748"/>
           <w:sz w:val="19"/>
         </w:rPr>
-        <w:t>A2 大境 6 戶之基地地籍臨接台中市公有計畫道路『龍社路』。車輛與人員進出直接銜接市區道路，**完全不需要通行富宇好境、悠境或清境之私設巷道（628、642 巷）**。不存在任何袋地通行權、私設道路維護費分攤爭議，具備百分之百的地緣獨立性。</w:t>
+        <w:t>A2 大境 6 戶之基地地籍臨接台中市公有計畫道路『龍社路』。車輛與人員進出直接銜接市區道路，**完全不需要通行富宇好境、悠境或清境之私設巷道（如 642 巷等）**。不存在任何袋地通行權、私設道路維護費分攤爭議，具備百分之百的地緣獨立性。</w:t>
       </w:r>
     </w:p>
     <w:p>
@@ -1916,9 +1766,6 @@
               <w:right w:w="100" w:type="dxa"/>
             </w:tcMar>
             <w:shd w:fill="1A1D20"/>
-            <w:shd w:fill="1A1D20"/>
-            <w:shd w:fill="1A1D20"/>
-            <w:shd w:fill="1A1D20"/>
           </w:tcPr>
           <w:p>
             <w:r>
@@ -1942,9 +1789,6 @@
               <w:left w:w="100" w:type="dxa"/>
               <w:right w:w="100" w:type="dxa"/>
             </w:tcMar>
-            <w:shd w:fill="1A1D20"/>
-            <w:shd w:fill="1A1D20"/>
-            <w:shd w:fill="1A1D20"/>
             <w:shd w:fill="1A1D20"/>
           </w:tcPr>
           <w:p>
@@ -1970,9 +1814,6 @@
               <w:right w:w="100" w:type="dxa"/>
             </w:tcMar>
             <w:shd w:fill="1A1D20"/>
-            <w:shd w:fill="1A1D20"/>
-            <w:shd w:fill="1A1D20"/>
-            <w:shd w:fill="1A1D20"/>
           </w:tcPr>
           <w:p>
             <w:r>
@@ -1996,9 +1837,6 @@
               <w:left w:w="100" w:type="dxa"/>
               <w:right w:w="100" w:type="dxa"/>
             </w:tcMar>
-            <w:shd w:fill="1A1D20"/>
-            <w:shd w:fill="1A1D20"/>
-            <w:shd w:fill="1A1D20"/>
             <w:shd w:fill="1A1D20"/>
           </w:tcPr>
           <w:p>
@@ -2026,9 +1864,6 @@
               <w:right w:w="100" w:type="dxa"/>
             </w:tcMar>
             <w:shd w:fill="FFFDF5"/>
-            <w:shd w:fill="FFFDF5"/>
-            <w:shd w:fill="FFFDF5"/>
-            <w:shd w:fill="FFFDF5"/>
           </w:tcPr>
           <w:p>
             <w:r>
@@ -2051,9 +1886,6 @@
               <w:left w:w="100" w:type="dxa"/>
               <w:right w:w="100" w:type="dxa"/>
             </w:tcMar>
-            <w:shd w:fill="FFFDF5"/>
-            <w:shd w:fill="FFFDF5"/>
-            <w:shd w:fill="FFFDF5"/>
             <w:shd w:fill="FFFDF5"/>
           </w:tcPr>
           <w:p>
@@ -2080,9 +1912,6 @@
               <w:right w:w="100" w:type="dxa"/>
             </w:tcMar>
             <w:shd w:fill="FFFDF5"/>
-            <w:shd w:fill="FFFDF5"/>
-            <w:shd w:fill="FFFDF5"/>
-            <w:shd w:fill="FFFDF5"/>
           </w:tcPr>
           <w:p>
             <w:r>
@@ -2107,9 +1936,6 @@
               <w:left w:w="100" w:type="dxa"/>
               <w:right w:w="100" w:type="dxa"/>
             </w:tcMar>
-            <w:shd w:fill="FFFDF5"/>
-            <w:shd w:fill="FFFDF5"/>
-            <w:shd w:fill="FFFDF5"/>
             <w:shd w:fill="FFFDF5"/>
           </w:tcPr>
           <w:p>
@@ -2136,9 +1962,6 @@
               <w:right w:w="100" w:type="dxa"/>
             </w:tcMar>
             <w:shd w:fill="FAF8F2"/>
-            <w:shd w:fill="FAF8F2"/>
-            <w:shd w:fill="FAF8F2"/>
-            <w:shd w:fill="FAF8F2"/>
           </w:tcPr>
           <w:p>
             <w:r>
@@ -2161,9 +1984,6 @@
               <w:left w:w="100" w:type="dxa"/>
               <w:right w:w="100" w:type="dxa"/>
             </w:tcMar>
-            <w:shd w:fill="FAF8F2"/>
-            <w:shd w:fill="FAF8F2"/>
-            <w:shd w:fill="FAF8F2"/>
             <w:shd w:fill="FAF8F2"/>
           </w:tcPr>
           <w:p>
@@ -2190,9 +2010,6 @@
               <w:right w:w="100" w:type="dxa"/>
             </w:tcMar>
             <w:shd w:fill="FAF8F2"/>
-            <w:shd w:fill="FAF8F2"/>
-            <w:shd w:fill="FAF8F2"/>
-            <w:shd w:fill="FAF8F2"/>
           </w:tcPr>
           <w:p>
             <w:r>
@@ -2217,9 +2034,6 @@
               <w:left w:w="100" w:type="dxa"/>
               <w:right w:w="100" w:type="dxa"/>
             </w:tcMar>
-            <w:shd w:fill="FAF8F2"/>
-            <w:shd w:fill="FAF8F2"/>
-            <w:shd w:fill="FAF8F2"/>
             <w:shd w:fill="FAF8F2"/>
           </w:tcPr>
           <w:p>
@@ -2246,9 +2060,6 @@
               <w:right w:w="100" w:type="dxa"/>
             </w:tcMar>
             <w:shd w:fill="FFFDF5"/>
-            <w:shd w:fill="FFFDF5"/>
-            <w:shd w:fill="FFFDF5"/>
-            <w:shd w:fill="FFFDF5"/>
           </w:tcPr>
           <w:p>
             <w:r>
@@ -2271,9 +2082,6 @@
               <w:left w:w="100" w:type="dxa"/>
               <w:right w:w="100" w:type="dxa"/>
             </w:tcMar>
-            <w:shd w:fill="FFFDF5"/>
-            <w:shd w:fill="FFFDF5"/>
-            <w:shd w:fill="FFFDF5"/>
             <w:shd w:fill="FFFDF5"/>
           </w:tcPr>
           <w:p>
@@ -2300,9 +2108,6 @@
               <w:right w:w="100" w:type="dxa"/>
             </w:tcMar>
             <w:shd w:fill="FFFDF5"/>
-            <w:shd w:fill="FFFDF5"/>
-            <w:shd w:fill="FFFDF5"/>
-            <w:shd w:fill="FFFDF5"/>
           </w:tcPr>
           <w:p>
             <w:r>
@@ -2325,9 +2130,6 @@
               <w:left w:w="100" w:type="dxa"/>
               <w:right w:w="100" w:type="dxa"/>
             </w:tcMar>
-            <w:shd w:fill="FFFDF5"/>
-            <w:shd w:fill="FFFDF5"/>
-            <w:shd w:fill="FFFDF5"/>
             <w:shd w:fill="FFFDF5"/>
           </w:tcPr>
           <w:p>
@@ -2354,9 +2156,6 @@
               <w:right w:w="100" w:type="dxa"/>
             </w:tcMar>
             <w:shd w:fill="FAF8F2"/>
-            <w:shd w:fill="FAF8F2"/>
-            <w:shd w:fill="FAF8F2"/>
-            <w:shd w:fill="FAF8F2"/>
           </w:tcPr>
           <w:p>
             <w:r>
@@ -2380,9 +2179,6 @@
               <w:left w:w="100" w:type="dxa"/>
               <w:right w:w="100" w:type="dxa"/>
             </w:tcMar>
-            <w:shd w:fill="FAF8F2"/>
-            <w:shd w:fill="FAF8F2"/>
-            <w:shd w:fill="FAF8F2"/>
             <w:shd w:fill="FAF8F2"/>
           </w:tcPr>
           <w:p>
@@ -2408,9 +2204,6 @@
               <w:right w:w="100" w:type="dxa"/>
             </w:tcMar>
             <w:shd w:fill="FAF8F2"/>
-            <w:shd w:fill="FAF8F2"/>
-            <w:shd w:fill="FAF8F2"/>
-            <w:shd w:fill="FAF8F2"/>
           </w:tcPr>
           <w:p>
             <w:r>
@@ -2434,9 +2227,6 @@
               <w:left w:w="100" w:type="dxa"/>
               <w:right w:w="100" w:type="dxa"/>
             </w:tcMar>
-            <w:shd w:fill="FAF8F2"/>
-            <w:shd w:fill="FAF8F2"/>
-            <w:shd w:fill="FAF8F2"/>
             <w:shd w:fill="FAF8F2"/>
           </w:tcPr>
           <w:p>
@@ -2504,9 +2294,6 @@
               <w:right w:w="100" w:type="dxa"/>
             </w:tcMar>
             <w:shd w:fill="1A1D20"/>
-            <w:shd w:fill="1A1D20"/>
-            <w:shd w:fill="1A1D20"/>
-            <w:shd w:fill="1A1D20"/>
           </w:tcPr>
           <w:p>
             <w:r>
@@ -2531,9 +2318,6 @@
               <w:right w:w="100" w:type="dxa"/>
             </w:tcMar>
             <w:shd w:fill="1A1D20"/>
-            <w:shd w:fill="1A1D20"/>
-            <w:shd w:fill="1A1D20"/>
-            <w:shd w:fill="1A1D20"/>
           </w:tcPr>
           <w:p>
             <w:r>
@@ -2557,9 +2341,6 @@
               <w:left w:w="100" w:type="dxa"/>
               <w:right w:w="100" w:type="dxa"/>
             </w:tcMar>
-            <w:shd w:fill="1A1D20"/>
-            <w:shd w:fill="1A1D20"/>
-            <w:shd w:fill="1A1D20"/>
             <w:shd w:fill="1A1D20"/>
           </w:tcPr>
           <w:p>
@@ -2587,9 +2368,6 @@
               <w:right w:w="100" w:type="dxa"/>
             </w:tcMar>
             <w:shd w:fill="FFFDF5"/>
-            <w:shd w:fill="FFFDF5"/>
-            <w:shd w:fill="FFFDF5"/>
-            <w:shd w:fill="FFFDF5"/>
           </w:tcPr>
           <w:p>
             <w:r>
@@ -2613,9 +2391,6 @@
               <w:right w:w="100" w:type="dxa"/>
             </w:tcMar>
             <w:shd w:fill="FFFDF5"/>
-            <w:shd w:fill="FFFDF5"/>
-            <w:shd w:fill="FFFDF5"/>
-            <w:shd w:fill="FFFDF5"/>
           </w:tcPr>
           <w:p>
             <w:r>
@@ -2638,9 +2413,6 @@
               <w:left w:w="100" w:type="dxa"/>
               <w:right w:w="100" w:type="dxa"/>
             </w:tcMar>
-            <w:shd w:fill="FFFDF5"/>
-            <w:shd w:fill="FFFDF5"/>
-            <w:shd w:fill="FFFDF5"/>
             <w:shd w:fill="FFFDF5"/>
           </w:tcPr>
           <w:p>
@@ -2667,9 +2439,6 @@
               <w:right w:w="100" w:type="dxa"/>
             </w:tcMar>
             <w:shd w:fill="FAF8F2"/>
-            <w:shd w:fill="FAF8F2"/>
-            <w:shd w:fill="FAF8F2"/>
-            <w:shd w:fill="FAF8F2"/>
           </w:tcPr>
           <w:p>
             <w:r>
@@ -2693,9 +2462,6 @@
               <w:right w:w="100" w:type="dxa"/>
             </w:tcMar>
             <w:shd w:fill="FAF8F2"/>
-            <w:shd w:fill="FAF8F2"/>
-            <w:shd w:fill="FAF8F2"/>
-            <w:shd w:fill="FAF8F2"/>
           </w:tcPr>
           <w:p>
             <w:r>
@@ -2718,9 +2484,6 @@
               <w:left w:w="100" w:type="dxa"/>
               <w:right w:w="100" w:type="dxa"/>
             </w:tcMar>
-            <w:shd w:fill="FAF8F2"/>
-            <w:shd w:fill="FAF8F2"/>
-            <w:shd w:fill="FAF8F2"/>
             <w:shd w:fill="FAF8F2"/>
           </w:tcPr>
           <w:p>
@@ -2747,9 +2510,6 @@
               <w:right w:w="100" w:type="dxa"/>
             </w:tcMar>
             <w:shd w:fill="FFFDF5"/>
-            <w:shd w:fill="FFFDF5"/>
-            <w:shd w:fill="FFFDF5"/>
-            <w:shd w:fill="FFFDF5"/>
           </w:tcPr>
           <w:p>
             <w:r>
@@ -2773,9 +2533,6 @@
               <w:right w:w="100" w:type="dxa"/>
             </w:tcMar>
             <w:shd w:fill="FFFDF5"/>
-            <w:shd w:fill="FFFDF5"/>
-            <w:shd w:fill="FFFDF5"/>
-            <w:shd w:fill="FFFDF5"/>
           </w:tcPr>
           <w:p>
             <w:r>
@@ -2798,9 +2555,6 @@
               <w:left w:w="100" w:type="dxa"/>
               <w:right w:w="100" w:type="dxa"/>
             </w:tcMar>
-            <w:shd w:fill="FFFDF5"/>
-            <w:shd w:fill="FFFDF5"/>
-            <w:shd w:fill="FFFDF5"/>
             <w:shd w:fill="FFFDF5"/>
           </w:tcPr>
           <w:p>
@@ -2827,9 +2581,6 @@
               <w:right w:w="100" w:type="dxa"/>
             </w:tcMar>
             <w:shd w:fill="FAF8F2"/>
-            <w:shd w:fill="FAF8F2"/>
-            <w:shd w:fill="FAF8F2"/>
-            <w:shd w:fill="FAF8F2"/>
           </w:tcPr>
           <w:p>
             <w:r>
@@ -2853,9 +2604,6 @@
               <w:right w:w="100" w:type="dxa"/>
             </w:tcMar>
             <w:shd w:fill="FAF8F2"/>
-            <w:shd w:fill="FAF8F2"/>
-            <w:shd w:fill="FAF8F2"/>
-            <w:shd w:fill="FAF8F2"/>
           </w:tcPr>
           <w:p>
             <w:r>
@@ -2878,9 +2626,6 @@
               <w:left w:w="100" w:type="dxa"/>
               <w:right w:w="100" w:type="dxa"/>
             </w:tcMar>
-            <w:shd w:fill="FAF8F2"/>
-            <w:shd w:fill="FAF8F2"/>
-            <w:shd w:fill="FAF8F2"/>
             <w:shd w:fill="FAF8F2"/>
           </w:tcPr>
           <w:p>
@@ -2907,9 +2652,6 @@
               <w:right w:w="100" w:type="dxa"/>
             </w:tcMar>
             <w:shd w:fill="FFFDF5"/>
-            <w:shd w:fill="FFFDF5"/>
-            <w:shd w:fill="FFFDF5"/>
-            <w:shd w:fill="FFFDF5"/>
           </w:tcPr>
           <w:p>
             <w:r>
@@ -2934,9 +2676,6 @@
               <w:right w:w="100" w:type="dxa"/>
             </w:tcMar>
             <w:shd w:fill="FFFDF5"/>
-            <w:shd w:fill="FFFDF5"/>
-            <w:shd w:fill="FFFDF5"/>
-            <w:shd w:fill="FFFDF5"/>
           </w:tcPr>
           <w:p>
             <w:r>
@@ -2960,9 +2699,6 @@
               <w:left w:w="100" w:type="dxa"/>
               <w:right w:w="100" w:type="dxa"/>
             </w:tcMar>
-            <w:shd w:fill="FFFDF5"/>
-            <w:shd w:fill="FFFDF5"/>
-            <w:shd w:fill="FFFDF5"/>
             <w:shd w:fill="FFFDF5"/>
           </w:tcPr>
           <w:p>
@@ -3483,9 +3219,6 @@
               <w:bottom w:val="none"/>
             </w:tcBorders>
             <w:shd w:fill="1A1D20"/>
-            <w:shd w:fill="1A1D20"/>
-            <w:shd w:fill="1A1D20"/>
-            <w:shd w:fill="1A1D20"/>
           </w:tcPr>
           <w:p>
             <w:pPr>
@@ -3515,17 +3248,17 @@
               <w:br/>
               <w:t>全體連署人名冊與簽章：</w:t>
               <w:br/>
-              <w:t>1. 龍社路 595 號  區權人：_______________  身分證字號：____________  簽章：_________</w:t>
+              <w:t>1. 龍社路 593 號  區權人：_______________  身分證字號：____________  簽章：_________</w:t>
               <w:br/>
-              <w:t>2. 龍社路 597 號  區權人：_______________  身分證字號：____________  簽章：_________</w:t>
+              <w:t>2. 龍社路 595 號  區權人：_______________  身分證字號：____________  簽章：_________</w:t>
               <w:br/>
-              <w:t>3. 龍社路 599 號  區權人：_______________  身分證字號：____________  簽章：_________</w:t>
+              <w:t>3. 龍社路 597 號  區權人：_______________  身分證字號：____________  簽章：_________</w:t>
               <w:br/>
-              <w:t>4. 龍社路 601 號  區權人：_______________  身分證字號：____________  簽章：_________</w:t>
+              <w:t>4. 龍社路 599 號  區權人：_______________  身分證字號：____________  簽章：_________</w:t>
               <w:br/>
-              <w:t>5. 龍社路 603 號  區權人：_______________  身分證字號：____________  簽章：_________</w:t>
+              <w:t>5. 龍社路 601 號  區權人：_______________  身分證字號：____________  簽章：_________</w:t>
               <w:br/>
-              <w:t>6. 龍社路 605 號  區權人：_______________  身分證字號：____________  簽章：_________</w:t>
+              <w:t>6. 龍社路 603 號  區權人：_______________  身分證字號：____________  簽章：_________</w:t>
               <w:br/>
               <w:t>中華民國 115 年 _____ 月 _____ 日</w:t>
             </w:r>
@@ -3579,9 +3312,6 @@
               <w:right w:val="none"/>
               <w:bottom w:val="none"/>
             </w:tcBorders>
-            <w:shd w:fill="1A1D20"/>
-            <w:shd w:fill="1A1D20"/>
-            <w:shd w:fill="1A1D20"/>
             <w:shd w:fill="1A1D20"/>
           </w:tcPr>
           <w:p>

</xml_diff>